<commit_message>
Kim12-1-3-Galvanik-Hucreler: gorsel alanlarina Shutter onizlemeleri yerlestirildi (2.3 bicimi)
</commit_message>
<xml_diff>
--- a/Kim12-1-3-Galvanik-Hucreler.docx
+++ b/Kim12-1-3-Galvanik-Hucreler.docx
@@ -22,165 +22,113 @@
         <w:t xml:space="preserve">BÖLÜM: Elektrokimyasal Hücreler</w:t>
       </w:r>
     </w:p>
-    <w:tbl>
-      <w:tblPr>
-        <w:tblW w:w="9000" w:type="dxa"/>
+    <w:p>
+      <w:pPr>
         <w:jc w:val="center"/>
-        <w:tblBorders>
-          <w:top w:val="single" w:sz="8" w:space="0" w:color="7F7F7F"/>
-          <w:left w:val="single" w:sz="8" w:space="0" w:color="7F7F7F"/>
-          <w:bottom w:val="single" w:sz="8" w:space="0" w:color="7F7F7F"/>
-          <w:right w:val="single" w:sz="8" w:space="0" w:color="7F7F7F"/>
-        </w:tblBorders>
-      </w:tblPr>
-      <w:tblGrid>
-        <w:gridCol w:w="9000"/>
-      </w:tblGrid>
-      <w:tr>
-        <w:tc>
-          <w:tcPr>
-            <w:tcW w:w="9000" w:type="dxa"/>
-            <w:shd w:val="clear" w:color="auto" w:fill="EDEDED"/>
-          </w:tcPr>
-          <w:p>
-            <w:pPr>
-              <w:jc w:val="both"/>
-              <w:rPr>
-                <w:rFonts w:ascii="Times New Roman" w:hAnsi="Times New Roman" w:cs="Times New Roman"/>
-                <w:lang w:val="tr-TR"/>
-              </w:rPr>
-            </w:pPr>
-            <w:r>
-              <w:rPr>
-                <w:rFonts w:ascii="Times New Roman" w:hAnsi="Times New Roman" w:cs="Times New Roman"/>
-                <w:lang w:val="tr-TR"/>
-              </w:rPr>
-              <w:t xml:space="preserve">GÖRSEL ALANI (Bölüm kapağı, tam sayfa; Shutterstock)</w:t>
-            </w:r>
-          </w:p>
-          <w:p>
-            <w:pPr>
-              <w:jc w:val="both"/>
-              <w:rPr>
-                <w:rFonts w:ascii="Times New Roman" w:hAnsi="Times New Roman" w:cs="Times New Roman"/>
-                <w:lang w:val="tr-TR"/>
-              </w:rPr>
-            </w:pPr>
-            <w:r>
-              <w:rPr>
-                <w:rFonts w:ascii="Times New Roman" w:hAnsi="Times New Roman" w:cs="Times New Roman"/>
-                <w:lang w:val="tr-TR"/>
-              </w:rPr>
-              <w:t xml:space="preserve">Tarif: Elektrikli bir araç bataryasının açık görünümü: sıra sıra dizilmiş silindirik lityum iyon hücreler ve bağlantı plakaları; teknolojik, temiz bir kompozisyon (tam sayfa bölüm kapağı).</w:t>
-            </w:r>
-          </w:p>
-          <w:p>
-            <w:pPr>
-              <w:jc w:val="both"/>
-              <w:rPr>
-                <w:rFonts w:ascii="Times New Roman" w:hAnsi="Times New Roman" w:cs="Times New Roman"/>
-                <w:lang w:val="tr-TR"/>
-              </w:rPr>
-            </w:pPr>
-            <w:r>
-              <w:rPr>
-                <w:rFonts w:ascii="Times New Roman" w:hAnsi="Times New Roman" w:cs="Times New Roman"/>
-                <w:lang w:val="tr-TR"/>
-              </w:rPr>
-              <w:t xml:space="preserve">Shutter ID: 2503974089 (fotoğraf) — Electric vehicle lithium NMC battery</w:t>
-            </w:r>
-          </w:p>
-        </w:tc>
-      </w:tr>
-    </w:tbl>
-    <w:p>
-      <w:pPr>
-        <w:jc w:val="both"/>
-        <w:rPr>
-          <w:rFonts w:ascii="Times New Roman" w:hAnsi="Times New Roman" w:cs="Times New Roman"/>
-          <w:lang w:val="tr-TR"/>
-        </w:rPr>
-      </w:pPr>
-    </w:p>
-    <w:tbl>
-      <w:tblPr>
-        <w:tblW w:w="9000" w:type="dxa"/>
+      </w:pPr>
+      <w:r>
+        <w:drawing>
+          <wp:inline xmlns:a="http://schemas.openxmlformats.org/drawingml/2006/main" xmlns:pic="http://schemas.openxmlformats.org/drawingml/2006/picture">
+            <wp:extent cx="5400000" cy="3859200"/>
+            <wp:docPr id="900014" name="Picture 900014"/>
+            <wp:cNvGraphicFramePr>
+              <a:graphicFrameLocks noChangeAspect="1"/>
+            </wp:cNvGraphicFramePr>
+            <a:graphic>
+              <a:graphicData uri="http://schemas.openxmlformats.org/drawingml/2006/picture">
+                <pic:pic>
+                  <pic:nvPicPr>
+                    <pic:cNvPr id="0" name="2503974089_d.jpg"/>
+                    <pic:cNvPicPr/>
+                  </pic:nvPicPr>
+                  <pic:blipFill>
+                    <a:blip r:embed="rId11"/>
+                    <a:stretch>
+                      <a:fillRect/>
+                    </a:stretch>
+                  </pic:blipFill>
+                  <pic:spPr>
+                    <a:xfrm>
+                      <a:off x="0" y="0"/>
+                      <a:ext cx="5400000" cy="3859200"/>
+                    </a:xfrm>
+                    <a:prstGeom prst="rect"/>
+                  </pic:spPr>
+                </pic:pic>
+              </a:graphicData>
+            </a:graphic>
+          </wp:inline>
+        </w:drawing>
+      </w:r>
+    </w:p>
+    <w:p>
+      <w:pPr>
         <w:jc w:val="center"/>
-        <w:tblBorders>
-          <w:top w:val="single" w:sz="8" w:space="0" w:color="7F7F7F"/>
-          <w:left w:val="single" w:sz="8" w:space="0" w:color="7F7F7F"/>
-          <w:bottom w:val="single" w:sz="8" w:space="0" w:color="7F7F7F"/>
-          <w:right w:val="single" w:sz="8" w:space="0" w:color="7F7F7F"/>
-        </w:tblBorders>
-      </w:tblPr>
-      <w:tblGrid>
-        <w:gridCol w:w="9000"/>
-      </w:tblGrid>
-      <w:tr>
-        <w:tc>
-          <w:tcPr>
-            <w:tcW w:w="9000" w:type="dxa"/>
-            <w:shd w:val="clear" w:color="auto" w:fill="EDEDED"/>
-          </w:tcPr>
-          <w:p>
-            <w:pPr>
-              <w:jc w:val="both"/>
-              <w:rPr>
-                <w:rFonts w:ascii="Times New Roman" w:hAnsi="Times New Roman" w:cs="Times New Roman"/>
-                <w:lang w:val="tr-TR"/>
-              </w:rPr>
-            </w:pPr>
-            <w:r>
-              <w:rPr>
-                <w:rFonts w:ascii="Times New Roman" w:hAnsi="Times New Roman" w:cs="Times New Roman"/>
-                <w:lang w:val="tr-TR"/>
-              </w:rPr>
-              <w:t xml:space="preserve">GÖRSEL ALANI (Shutterstock)</w:t>
-            </w:r>
-          </w:p>
-          <w:p>
-            <w:pPr>
-              <w:jc w:val="both"/>
-              <w:rPr>
-                <w:rFonts w:ascii="Times New Roman" w:hAnsi="Times New Roman" w:cs="Times New Roman"/>
-                <w:lang w:val="tr-TR"/>
-              </w:rPr>
-            </w:pPr>
-            <w:r>
-              <w:rPr>
-                <w:rFonts w:ascii="Times New Roman" w:hAnsi="Times New Roman" w:cs="Times New Roman"/>
-                <w:lang w:val="tr-TR"/>
-              </w:rPr>
-              <w:t xml:space="preserve">Tarif: Şehir içindeki bir şarj istasyonunda kablosu takılı, şarj olan bir elektrikli otomobil; arka planda güneş panelleri. Marka, logo ve plaka görünmesin.</w:t>
-            </w:r>
-          </w:p>
-          <w:p>
-            <w:pPr>
-              <w:jc w:val="both"/>
-              <w:rPr>
-                <w:rFonts w:ascii="Times New Roman" w:hAnsi="Times New Roman" w:cs="Times New Roman"/>
-                <w:lang w:val="tr-TR"/>
-              </w:rPr>
-            </w:pPr>
-            <w:r>
-              <w:rPr>
-                <w:rFonts w:ascii="Times New Roman" w:hAnsi="Times New Roman" w:cs="Times New Roman"/>
-                <w:lang w:val="tr-TR"/>
-              </w:rPr>
-              <w:t xml:space="preserve">Shutter ID: 2466917493 (fotoğraf) — Electric car is charged from a charging station</w:t>
-            </w:r>
-          </w:p>
-        </w:tc>
-      </w:tr>
-    </w:tbl>
-    <w:p>
-      <w:pPr>
-        <w:jc w:val="both"/>
-        <w:rPr>
-          <w:rFonts w:ascii="Times New Roman" w:hAnsi="Times New Roman" w:cs="Times New Roman"/>
-          <w:lang w:val="tr-TR"/>
-        </w:rPr>
-      </w:pPr>
+      </w:pPr>
+      <w:r>
+        <w:rPr>
+          <w:rFonts w:ascii="Times New Roman" w:hAnsi="Times New Roman" w:cs="Times New Roman"/>
+          <w:b/>
+          <w:bCs/>
+          <w:highlight w:val="yellow"/>
+          <w:lang w:val="tr-TR"/>
+        </w:rPr>
+        <w:t xml:space="preserve">Shutter id: 2503974089 (bölüm kapağı, tam sayfa)</w:t>
+      </w:r>
+    </w:p>
+    <w:p>
+      <w:pPr>
+        <w:jc w:val="center"/>
+      </w:pPr>
+      <w:r>
+        <w:drawing>
+          <wp:inline xmlns:a="http://schemas.openxmlformats.org/drawingml/2006/main" xmlns:pic="http://schemas.openxmlformats.org/drawingml/2006/picture">
+            <wp:extent cx="4324942" cy="2520000"/>
+            <wp:docPr id="900015" name="Picture 900015"/>
+            <wp:cNvGraphicFramePr>
+              <a:graphicFrameLocks noChangeAspect="1"/>
+            </wp:cNvGraphicFramePr>
+            <a:graphic>
+              <a:graphicData uri="http://schemas.openxmlformats.org/drawingml/2006/picture">
+                <pic:pic>
+                  <pic:nvPicPr>
+                    <pic:cNvPr id="0" name="2466917493_d.jpg"/>
+                    <pic:cNvPicPr/>
+                  </pic:nvPicPr>
+                  <pic:blipFill>
+                    <a:blip r:embed="rId12"/>
+                    <a:stretch>
+                      <a:fillRect/>
+                    </a:stretch>
+                  </pic:blipFill>
+                  <pic:spPr>
+                    <a:xfrm>
+                      <a:off x="0" y="0"/>
+                      <a:ext cx="4324942" cy="2520000"/>
+                    </a:xfrm>
+                    <a:prstGeom prst="rect"/>
+                  </pic:spPr>
+                </pic:pic>
+              </a:graphicData>
+            </a:graphic>
+          </wp:inline>
+        </w:drawing>
+      </w:r>
+    </w:p>
+    <w:p>
+      <w:pPr>
+        <w:jc w:val="center"/>
+      </w:pPr>
+      <w:r>
+        <w:rPr>
+          <w:rFonts w:ascii="Times New Roman" w:hAnsi="Times New Roman" w:cs="Times New Roman"/>
+          <w:b/>
+          <w:bCs/>
+          <w:highlight w:val="yellow"/>
+          <w:lang w:val="tr-TR"/>
+        </w:rPr>
+        <w:t xml:space="preserve">Shutter id: 2466917493</w:t>
+      </w:r>
     </w:p>
     <w:p>
       <w:pPr>
@@ -687,101 +635,59 @@
         <w:t xml:space="preserve">1780’li yıllarda İtalyan hekim Luigi Galvani, kurbağa bacaklarıyla çalışırken ilginç bir durum fark etti: Bacağın siniri ve kası iki farklı metalden yapılmış bir yayla birbirine dokundurulduğunda kas seğiriyordu. Galvani bu olayı canlı dokunun ürettiği “hayvansal elektrik” ile açıkladı. Fizikçi Alessandro Volta ise elektriğin kaynağının kurbağa değil iki farklı metal olduğunu düşündü. 1800 yılında çinko ve bakır diskleri, tuzlu suya batırılmış karton parçalarıyla ayırarak üst üste dizdi ve sürekli elektrik akımı veren ilk düzeneği, Volta pilini yaptı (Görsel B). Bugün kullandığımız gerilim birimi “volt” da adını ondan alır. Peki iki farklı metal ve bir tuz çözeltisinden oluşan bir düzenek nasıl elektrik üretebilir? Önceki konularda incelediğiniz redoks tepkimelerinde elektronlar bir türden diğerine aktarılıyordu. Bu elektron aktarımı bir telden geçirilerek elektrik enerjisine dönüştürülebilir mi? Bu sorunun cevabını bir etkinlik yaparak keşfediniz.</w:t>
       </w:r>
     </w:p>
-    <w:tbl>
-      <w:tblPr>
-        <w:tblW w:w="9000" w:type="dxa"/>
+    <w:p>
+      <w:pPr>
         <w:jc w:val="center"/>
-        <w:tblBorders>
-          <w:top w:val="single" w:sz="8" w:space="0" w:color="7F7F7F"/>
-          <w:left w:val="single" w:sz="8" w:space="0" w:color="7F7F7F"/>
-          <w:bottom w:val="single" w:sz="8" w:space="0" w:color="7F7F7F"/>
-          <w:right w:val="single" w:sz="8" w:space="0" w:color="7F7F7F"/>
-        </w:tblBorders>
-      </w:tblPr>
-      <w:tblGrid>
-        <w:gridCol w:w="9000"/>
-      </w:tblGrid>
-      <w:tr>
-        <w:tc>
-          <w:tcPr>
-            <w:tcW w:w="9000" w:type="dxa"/>
-            <w:shd w:val="clear" w:color="auto" w:fill="EDEDED"/>
-          </w:tcPr>
-          <w:p>
-            <w:pPr>
-              <w:jc w:val="both"/>
-              <w:rPr>
-                <w:rFonts w:ascii="Times New Roman" w:hAnsi="Times New Roman" w:cs="Times New Roman"/>
-                <w:lang w:val="tr-TR"/>
-              </w:rPr>
-            </w:pPr>
-            <w:r>
-              <w:rPr>
-                <w:rFonts w:ascii="Times New Roman" w:hAnsi="Times New Roman" w:cs="Times New Roman"/>
-                <w:lang w:val="tr-TR"/>
-              </w:rPr>
-              <w:t xml:space="preserve">GÖRSEL ALANI</w:t>
-            </w:r>
-          </w:p>
-          <w:p>
-            <w:pPr>
-              <w:jc w:val="both"/>
-              <w:rPr>
-                <w:rFonts w:ascii="Times New Roman" w:hAnsi="Times New Roman" w:cs="Times New Roman"/>
-                <w:lang w:val="tr-TR"/>
-              </w:rPr>
-            </w:pPr>
-            <w:r>
-              <w:rPr>
-                <w:rFonts w:ascii="Times New Roman" w:hAnsi="Times New Roman" w:cs="Times New Roman"/>
-                <w:lang w:val="tr-TR"/>
-              </w:rPr>
-              <w:t xml:space="preserve">Tarif: Müzede ya da laboratuvarda sergilenen, üst üste dizilmiş metal diskler ve aralarındaki ıslak karton/kumaş katmanlarından oluşan Volta pili replikası; mümkünse uçlarına bağlı teller görünsün.</w:t>
-            </w:r>
-          </w:p>
-          <w:p>
-            <w:pPr>
-              <w:jc w:val="both"/>
-              <w:rPr>
-                <w:rFonts w:ascii="Times New Roman" w:hAnsi="Times New Roman" w:cs="Times New Roman"/>
-                <w:lang w:val="tr-TR"/>
-              </w:rPr>
-            </w:pPr>
-            <w:r>
-              <w:rPr>
-                <w:rFonts w:ascii="Times New Roman" w:hAnsi="Times New Roman" w:cs="Times New Roman"/>
-                <w:lang w:val="tr-TR"/>
-              </w:rPr>
-              <w:t xml:space="preserve">Shutterstock arama: “voltaic pile replica”</w:t>
-            </w:r>
-          </w:p>
-          <w:p>
-            <w:pPr>
-              <w:jc w:val="both"/>
-              <w:rPr>
-                <w:rFonts w:ascii="Times New Roman" w:hAnsi="Times New Roman" w:cs="Times New Roman"/>
-                <w:lang w:val="tr-TR"/>
-              </w:rPr>
-            </w:pPr>
-            <w:r>
-              <w:rPr>
-                <w:rFonts w:ascii="Times New Roman" w:hAnsi="Times New Roman" w:cs="Times New Roman"/>
-                <w:lang w:val="tr-TR"/>
-              </w:rPr>
-              <w:t xml:space="preserve">Shutter ID: 1822298069 (Volta pilinin üç boyutlu görselleştirmesi). Alternatif fotoğraf: 2300220403 (bakır para ve alüminyum folyodan yapılmış basit pil).</w:t>
-            </w:r>
-          </w:p>
-        </w:tc>
-      </w:tr>
-    </w:tbl>
-    <w:p>
-      <w:pPr>
-        <w:jc w:val="both"/>
-        <w:rPr>
-          <w:rFonts w:ascii="Times New Roman" w:hAnsi="Times New Roman" w:cs="Times New Roman"/>
-          <w:lang w:val="tr-TR"/>
-        </w:rPr>
-      </w:pPr>
+      </w:pPr>
+      <w:r>
+        <w:drawing>
+          <wp:inline xmlns:a="http://schemas.openxmlformats.org/drawingml/2006/main" xmlns:pic="http://schemas.openxmlformats.org/drawingml/2006/picture">
+            <wp:extent cx="2488479" cy="2520000"/>
+            <wp:docPr id="900016" name="Picture 900016"/>
+            <wp:cNvGraphicFramePr>
+              <a:graphicFrameLocks noChangeAspect="1"/>
+            </wp:cNvGraphicFramePr>
+            <a:graphic>
+              <a:graphicData uri="http://schemas.openxmlformats.org/drawingml/2006/picture">
+                <pic:pic>
+                  <pic:nvPicPr>
+                    <pic:cNvPr id="0" name="1822298069_d.jpg"/>
+                    <pic:cNvPicPr/>
+                  </pic:nvPicPr>
+                  <pic:blipFill>
+                    <a:blip r:embed="rId13"/>
+                    <a:stretch>
+                      <a:fillRect/>
+                    </a:stretch>
+                  </pic:blipFill>
+                  <pic:spPr>
+                    <a:xfrm>
+                      <a:off x="0" y="0"/>
+                      <a:ext cx="2488479" cy="2520000"/>
+                    </a:xfrm>
+                    <a:prstGeom prst="rect"/>
+                  </pic:spPr>
+                </pic:pic>
+              </a:graphicData>
+            </a:graphic>
+          </wp:inline>
+        </w:drawing>
+      </w:r>
+    </w:p>
+    <w:p>
+      <w:pPr>
+        <w:jc w:val="center"/>
+      </w:pPr>
+      <w:r>
+        <w:rPr>
+          <w:rFonts w:ascii="Times New Roman" w:hAnsi="Times New Roman" w:cs="Times New Roman"/>
+          <w:b/>
+          <w:bCs/>
+          <w:highlight w:val="yellow"/>
+          <w:lang w:val="tr-TR"/>
+        </w:rPr>
+        <w:t xml:space="preserve">Shutter id: 1822298069</w:t>
+      </w:r>
     </w:p>
     <w:p>
       <w:pPr>
@@ -6083,85 +5989,59 @@
         <w:t xml:space="preserve">Kalbin ritmini düzenleyen kalp pilleri, deri altına yerleştirilen ve yıllarca kesintisiz çalışması gereken küçük cihazlardır (aşağıdaki görsel). 1970’lerin başından itibaren bu cihazlarda lityum-iyot pilleri kullanılmaya başlanmıştır. Bu pillerde anot lityum metalidir; katotta ise iyot içeren bir karışım bulunur. Hücrede lityum yükseltgenirken iyot indirgenir ve yaklaşık 2,8 V gerilim elde edilir. Lityum-iyot pilleri gaz çıkışı olmadan çalıştığı için tamamen kapalı tasarlanabilir ve kullanım süresine göre genellikle 5-10 yıl, bazı tasarımlarda daha da uzun süre görev yapabilir. Daha önce kullanılan pillerin birkaç yılda bir değiştirilmesi gerektiği düşünüldüğünde bu gelişme hastaların hayat kalitesini önemli ölçüde artırmıştır.</w:t>
       </w:r>
     </w:p>
-    <w:tbl>
-      <w:tblPr>
-        <w:tblW w:w="9000" w:type="dxa"/>
+    <w:p>
+      <w:pPr>
         <w:jc w:val="center"/>
-        <w:tblBorders>
-          <w:top w:val="single" w:sz="8" w:space="0" w:color="7F7F7F"/>
-          <w:left w:val="single" w:sz="8" w:space="0" w:color="7F7F7F"/>
-          <w:bottom w:val="single" w:sz="8" w:space="0" w:color="7F7F7F"/>
-          <w:right w:val="single" w:sz="8" w:space="0" w:color="7F7F7F"/>
-        </w:tblBorders>
-      </w:tblPr>
-      <w:tblGrid>
-        <w:gridCol w:w="9000"/>
-      </w:tblGrid>
-      <w:tr>
-        <w:tc>
-          <w:tcPr>
-            <w:tcW w:w="9000" w:type="dxa"/>
-            <w:shd w:val="clear" w:color="auto" w:fill="EDEDED"/>
-          </w:tcPr>
-          <w:p>
-            <w:pPr>
-              <w:jc w:val="both"/>
-              <w:rPr>
-                <w:rFonts w:ascii="Times New Roman" w:hAnsi="Times New Roman" w:cs="Times New Roman"/>
-                <w:lang w:val="tr-TR"/>
-              </w:rPr>
-            </w:pPr>
-            <w:r>
-              <w:rPr>
-                <w:rFonts w:ascii="Times New Roman" w:hAnsi="Times New Roman" w:cs="Times New Roman"/>
-                <w:lang w:val="tr-TR"/>
-              </w:rPr>
-              <w:t xml:space="preserve">GÖRSEL ALANI (Shutterstock)</w:t>
-            </w:r>
-          </w:p>
-          <w:p>
-            <w:pPr>
-              <w:jc w:val="both"/>
-              <w:rPr>
-                <w:rFonts w:ascii="Times New Roman" w:hAnsi="Times New Roman" w:cs="Times New Roman"/>
-                <w:lang w:val="tr-TR"/>
-              </w:rPr>
-            </w:pPr>
-            <w:r>
-              <w:rPr>
-                <w:rFonts w:ascii="Times New Roman" w:hAnsi="Times New Roman" w:cs="Times New Roman"/>
-                <w:lang w:val="tr-TR"/>
-              </w:rPr>
-              <w:t xml:space="preserve">Tarif: Beyaz zemin üzerinde metal gövdeli bir kalp pili ve elektrot kabloları; yanında ölçek için bir madeni para ya da avuç içi. Marka/logo görünmesin.</w:t>
-            </w:r>
-          </w:p>
-          <w:p>
-            <w:pPr>
-              <w:jc w:val="both"/>
-              <w:rPr>
-                <w:rFonts w:ascii="Times New Roman" w:hAnsi="Times New Roman" w:cs="Times New Roman"/>
-                <w:lang w:val="tr-TR"/>
-              </w:rPr>
-            </w:pPr>
-            <w:r>
-              <w:rPr>
-                <w:rFonts w:ascii="Times New Roman" w:hAnsi="Times New Roman" w:cs="Times New Roman"/>
-                <w:lang w:val="tr-TR"/>
-              </w:rPr>
-              <w:t xml:space="preserve">Shutter ID: 2450344123 (fotoğraf) — Pacemaker isolated on a white background</w:t>
-            </w:r>
-          </w:p>
-        </w:tc>
-      </w:tr>
-    </w:tbl>
-    <w:p>
-      <w:pPr>
-        <w:jc w:val="both"/>
-        <w:rPr>
-          <w:rFonts w:ascii="Times New Roman" w:hAnsi="Times New Roman" w:cs="Times New Roman"/>
-          <w:lang w:val="tr-TR"/>
-        </w:rPr>
-      </w:pPr>
+      </w:pPr>
+      <w:r>
+        <w:drawing>
+          <wp:inline xmlns:a="http://schemas.openxmlformats.org/drawingml/2006/main" xmlns:pic="http://schemas.openxmlformats.org/drawingml/2006/picture">
+            <wp:extent cx="3436363" cy="2520000"/>
+            <wp:docPr id="900017" name="Picture 900017"/>
+            <wp:cNvGraphicFramePr>
+              <a:graphicFrameLocks noChangeAspect="1"/>
+            </wp:cNvGraphicFramePr>
+            <a:graphic>
+              <a:graphicData uri="http://schemas.openxmlformats.org/drawingml/2006/picture">
+                <pic:pic>
+                  <pic:nvPicPr>
+                    <pic:cNvPr id="0" name="2450344123_d.jpg"/>
+                    <pic:cNvPicPr/>
+                  </pic:nvPicPr>
+                  <pic:blipFill>
+                    <a:blip r:embed="rId14"/>
+                    <a:stretch>
+                      <a:fillRect/>
+                    </a:stretch>
+                  </pic:blipFill>
+                  <pic:spPr>
+                    <a:xfrm>
+                      <a:off x="0" y="0"/>
+                      <a:ext cx="3436363" cy="2520000"/>
+                    </a:xfrm>
+                    <a:prstGeom prst="rect"/>
+                  </pic:spPr>
+                </pic:pic>
+              </a:graphicData>
+            </a:graphic>
+          </wp:inline>
+        </w:drawing>
+      </w:r>
+    </w:p>
+    <w:p>
+      <w:pPr>
+        <w:jc w:val="center"/>
+      </w:pPr>
+      <w:r>
+        <w:rPr>
+          <w:rFonts w:ascii="Times New Roman" w:hAnsi="Times New Roman" w:cs="Times New Roman"/>
+          <w:b/>
+          <w:bCs/>
+          <w:highlight w:val="yellow"/>
+          <w:lang w:val="tr-TR"/>
+        </w:rPr>
+        <w:t xml:space="preserve">Shutter id: 2450344123</w:t>
+      </w:r>
     </w:p>
     <w:p>
       <w:pPr>

</xml_diff>